<commit_message>
Rebalance D2C copy and comparison table
</commit_message>
<xml_diff>
--- a/AceCard_Two_Products.docx
+++ b/AceCard_Two_Products.docx
@@ -108,7 +108,7 @@
                 <w:sz w:val="22"/>
                 <w:szCs w:val="22"/>
               </w:rPr>
-              <w:t xml:space="preserve">AceCard sells two separate products. </w:t>
+              <w:t xml:space="preserve">AceCard runs two separate products under one brand. </w:t>
             </w:r>
             <w:r>
               <w:rPr>
@@ -122,13 +122,13 @@
                 <w:sz w:val="22"/>
                 <w:szCs w:val="22"/>
               </w:rPr>
-              <w:t xml:space="preserve">One is a personal digital business card for individuals. </w:t>
-            </w:r>
-            <w:r>
-              <w:rPr>
-                <w:rFonts w:ascii="Arial" w:cs="Arial" w:eastAsia="Arial" w:hAnsi="Arial"/>
-                <w:b/>
-                <w:bCs/>
+              <w:t xml:space="preserve">The Ace Smart Card</w:t>
+            </w:r>
+            <w:r>
+              <w:rPr>
+                <w:rFonts w:ascii="Arial" w:cs="Arial" w:eastAsia="Arial" w:hAnsi="Arial"/>
+                <w:b w:val="false"/>
+                <w:bCs w:val="false"/>
                 <w:i w:val="false"/>
                 <w:iCs w:val="false"/>
                 <w:caps w:val="false"/>
@@ -136,13 +136,13 @@
                 <w:sz w:val="22"/>
                 <w:szCs w:val="22"/>
               </w:rPr>
-              <w:t xml:space="preserve">The other is a sales platform companies buy for their reps. </w:t>
-            </w:r>
-            <w:r>
-              <w:rPr>
-                <w:rFonts w:ascii="Arial" w:cs="Arial" w:eastAsia="Arial" w:hAnsi="Arial"/>
-                <w:b w:val="false"/>
-                <w:bCs w:val="false"/>
+              <w:t xml:space="preserve"> is a premium digital business card individuals buy for themselves. </w:t>
+            </w:r>
+            <w:r>
+              <w:rPr>
+                <w:rFonts w:ascii="Arial" w:cs="Arial" w:eastAsia="Arial" w:hAnsi="Arial"/>
+                <w:b/>
+                <w:bCs/>
                 <w:i w:val="false"/>
                 <w:iCs w:val="false"/>
                 <w:caps w:val="false"/>
@@ -150,7 +150,21 @@
                 <w:sz w:val="22"/>
                 <w:szCs w:val="22"/>
               </w:rPr>
-              <w:t xml:space="preserve">This document explains what each one includes, how it works, and what it costs.</w:t>
+              <w:t xml:space="preserve">AceCard</w:t>
+            </w:r>
+            <w:r>
+              <w:rPr>
+                <w:rFonts w:ascii="Arial" w:cs="Arial" w:eastAsia="Arial" w:hAnsi="Arial"/>
+                <w:b w:val="false"/>
+                <w:bCs w:val="false"/>
+                <w:i w:val="false"/>
+                <w:iCs w:val="false"/>
+                <w:caps w:val="false"/>
+                <w:color w:val="C9D2E0"/>
+                <w:sz w:val="22"/>
+                <w:szCs w:val="22"/>
+              </w:rPr>
+              <w:t xml:space="preserve"> is a full sales platform companies buy for their reps. This document explains what each one includes, how it works, and what it costs.</w:t>
             </w:r>
           </w:p>
         </w:tc>
@@ -353,7 +367,7 @@
                       <w:sz w:val="19"/>
                       <w:szCs w:val="19"/>
                     </w:rPr>
-                    <w:t xml:space="preserve">A digital business card for one person.</w:t>
+                    <w:t xml:space="preserve">A premium digital business card. Yours forever.</w:t>
                   </w:r>
                 </w:p>
               </w:tc>
@@ -411,7 +425,7 @@
                       <w:sz w:val="19"/>
                       <w:szCs w:val="19"/>
                     </w:rPr>
-                    <w:t xml:space="preserve">An individual.</w:t>
+                    <w:t xml:space="preserve">An individual — founders, executives, consultants, anyone whose first impression matters.</w:t>
                   </w:r>
                 </w:p>
                 <w:p>
@@ -449,7 +463,7 @@
                       <w:sz w:val="19"/>
                       <w:szCs w:val="19"/>
                     </w:rPr>
-                    <w:t xml:space="preserve">An NFC card and a personal web profile.</w:t>
+                    <w:t xml:space="preserve">A matte-black NFC card and a personal web page with your photo, video, social, portfolio and calendar.</w:t>
                   </w:r>
                 </w:p>
                 <w:p>
@@ -487,7 +501,7 @@
                       <w:sz w:val="19"/>
                       <w:szCs w:val="19"/>
                     </w:rPr>
-                    <w:t xml:space="preserve">₹3,500. One-time. No recurring cost.</w:t>
+                    <w:t xml:space="preserve">₹3,500. Pay once. Use it forever — including the hosting.</w:t>
                   </w:r>
                 </w:p>
                 <w:p>
@@ -653,7 +667,7 @@
                       <w:sz w:val="19"/>
                       <w:szCs w:val="19"/>
                     </w:rPr>
-                    <w:t xml:space="preserve">A sales platform companies buy for their reps.</w:t>
+                    <w:t xml:space="preserve">A full sales platform built around the card.</w:t>
                   </w:r>
                 </w:p>
               </w:tc>
@@ -711,7 +725,7 @@
                       <w:sz w:val="19"/>
                       <w:szCs w:val="19"/>
                     </w:rPr>
-                    <w:t xml:space="preserve">A sales team. 10 to 1,000+ reps.</w:t>
+                    <w:t xml:space="preserve">A sales team. From 10 to 1,000+ reps.</w:t>
                   </w:r>
                 </w:p>
                 <w:p>
@@ -749,7 +763,7 @@
                       <w:sz w:val="19"/>
                       <w:szCs w:val="19"/>
                     </w:rPr>
-                    <w:t xml:space="preserve">Cards and profiles for every rep, plus voice-to-CRM, a mobile app, an admin dashboard, and CRM integrations.</w:t>
+                    <w:t xml:space="preserve">Branded cards and profiles for every rep, plus voice-to-CRM, a mobile app, an admin dashboard and native CRM integrations.</w:t>
                   </w:r>
                 </w:p>
                 <w:p>
@@ -878,7 +892,7 @@
           <w:sz w:val="21"/>
           <w:szCs w:val="21"/>
         </w:rPr>
-        <w:t xml:space="preserve">A digital business card for one person. You get a physical NFC card and a personal web page. Hand the card to someone — they tap it on their phone, your page opens. </w:t>
+        <w:t xml:space="preserve">A premium NFC business card paired with a personal web page. Hand it to someone, they tap it on their phone, and the page opens — your photo, your video, your story, your work, and a calendar button to book time with you. </w:t>
       </w:r>
       <w:r>
         <w:rPr>
@@ -892,7 +906,21 @@
           <w:sz w:val="21"/>
           <w:szCs w:val="21"/>
         </w:rPr>
-        <w:t xml:space="preserve">No app to download. No QR to scan. No email to type.</w:t>
+        <w:t xml:space="preserve">No app to download. No QR to scan. No email asked. </w:t>
+      </w:r>
+      <w:r>
+        <w:rPr>
+          <w:rFonts w:ascii="Arial" w:cs="Arial" w:eastAsia="Arial" w:hAnsi="Arial"/>
+          <w:b/>
+          <w:bCs/>
+          <w:i w:val="false"/>
+          <w:iCs w:val="false"/>
+          <w:caps w:val="false"/>
+          <w:color w:val="1A1A1A"/>
+          <w:sz w:val="21"/>
+          <w:szCs w:val="21"/>
+        </w:rPr>
+        <w:t xml:space="preserve">Pay once, use it for life.</w:t>
       </w:r>
     </w:p>
     <w:p>
@@ -1003,7 +1031,7 @@
                 <w:sz w:val="22"/>
                 <w:szCs w:val="22"/>
               </w:rPr>
-              <w:t xml:space="preserve">The NFC card</w:t>
+              <w:t xml:space="preserve">A matte-black NFC card</w:t>
             </w:r>
           </w:p>
           <w:p>
@@ -1022,7 +1050,7 @@
                 <w:sz w:val="19"/>
                 <w:szCs w:val="19"/>
               </w:rPr>
-              <w:t xml:space="preserve">A matte-black card with an NFC chip inside. </w:t>
+              <w:t xml:space="preserve">Sleek, premium card with an NFC chip inside. </w:t>
             </w:r>
             <w:r>
               <w:rPr>
@@ -1036,7 +1064,7 @@
                 <w:sz w:val="19"/>
                 <w:szCs w:val="19"/>
               </w:rPr>
-              <w:t xml:space="preserve">No company logo on the back. </w:t>
+              <w:t xml:space="preserve">No company logo. No expiry. </w:t>
             </w:r>
             <w:r>
               <w:rPr>
@@ -1050,7 +1078,7 @@
                 <w:sz w:val="19"/>
                 <w:szCs w:val="19"/>
               </w:rPr>
-              <w:t xml:space="preserve">iPhone reads it from the front camera. Android reads it from the back. Hold it to any phone — your profile opens in one second.</w:t>
+              <w:t xml:space="preserve">iPhone reads it from the front camera. Android reads it from the back. Holds up tens of thousands of taps — one card is built to last as long as you do.</w:t>
             </w:r>
           </w:p>
         </w:tc>
@@ -1128,7 +1156,7 @@
                 <w:sz w:val="22"/>
                 <w:szCs w:val="22"/>
               </w:rPr>
-              <w:t xml:space="preserve">The personal web profile</w:t>
+              <w:t xml:space="preserve">A personal web page at your own URL</w:t>
             </w:r>
           </w:p>
           <w:p>
@@ -1147,7 +1175,7 @@
                 <w:sz w:val="19"/>
                 <w:szCs w:val="19"/>
               </w:rPr>
-              <w:t xml:space="preserve">A real web page at your AceCard URL. Your photo, your story, a video, your social links, a calendar button. </w:t>
+              <w:t xml:space="preserve">A real, full-page website — not a list of links. </w:t>
             </w:r>
             <w:r>
               <w:rPr>
@@ -1161,7 +1189,7 @@
                 <w:sz w:val="19"/>
                 <w:szCs w:val="19"/>
               </w:rPr>
-              <w:t xml:space="preserve">Drag and drop blocks in any order. </w:t>
+              <w:t xml:space="preserve">Put anything on it: </w:t>
             </w:r>
             <w:r>
               <w:rPr>
@@ -1175,7 +1203,7 @@
                 <w:sz w:val="19"/>
                 <w:szCs w:val="19"/>
               </w:rPr>
-              <w:t xml:space="preserve">No watermarks, no other brand on your page.</w:t>
+              <w:t xml:space="preserve">your photo, a featured video that plays inline, your story, your portfolio, your podcast, your social handles, a 'book a call' button that opens your calendar. Drag and drop blocks in any order. Update it any time from your phone. No watermarks, no other brand on your page.</w:t>
             </w:r>
           </w:p>
         </w:tc>
@@ -1272,7 +1300,7 @@
                 <w:sz w:val="19"/>
                 <w:szCs w:val="19"/>
               </w:rPr>
-              <w:t xml:space="preserve">You set up your profile</w:t>
+              <w:t xml:space="preserve">Build your page</w:t>
             </w:r>
           </w:p>
           <w:p>
@@ -1291,7 +1319,21 @@
                 <w:sz w:val="16"/>
                 <w:szCs w:val="16"/>
               </w:rPr>
-              <w:t xml:space="preserve">Add your photo, story, video, links, calendar button.</w:t>
+              <w:t xml:space="preserve">Add your photo, video, links, calendar. </w:t>
+            </w:r>
+            <w:r>
+              <w:rPr>
+                <w:rFonts w:ascii="Arial" w:cs="Arial" w:eastAsia="Arial" w:hAnsi="Arial"/>
+                <w:b/>
+                <w:bCs/>
+                <w:i w:val="false"/>
+                <w:iCs w:val="false"/>
+                <w:caps w:val="false"/>
+                <w:color w:val="6B7280"/>
+                <w:sz w:val="16"/>
+                <w:szCs w:val="16"/>
+              </w:rPr>
+              <w:t xml:space="preserve">Takes ten minutes.</w:t>
             </w:r>
           </w:p>
         </w:tc>
@@ -1384,7 +1426,7 @@
                 <w:sz w:val="19"/>
                 <w:szCs w:val="19"/>
               </w:rPr>
-              <w:t xml:space="preserve">You hand someone the card</w:t>
+              <w:t xml:space="preserve">Hand someone the card</w:t>
             </w:r>
           </w:p>
           <w:p>
@@ -1403,7 +1445,7 @@
                 <w:sz w:val="16"/>
                 <w:szCs w:val="16"/>
               </w:rPr>
-              <w:t xml:space="preserve">Meetings, conferences, lunch — anywhere you'd use paper.</w:t>
+              <w:t xml:space="preserve">Meetings, events, lunch — anywhere you'd use paper.</w:t>
             </w:r>
           </w:p>
         </w:tc>
@@ -1496,7 +1538,7 @@
                 <w:sz w:val="19"/>
                 <w:szCs w:val="19"/>
               </w:rPr>
-              <w:t xml:space="preserve">They tap it on their phone</w:t>
+              <w:t xml:space="preserve">They tap. Page opens.</w:t>
             </w:r>
           </w:p>
           <w:p>
@@ -1515,21 +1557,7 @@
                 <w:sz w:val="16"/>
                 <w:szCs w:val="16"/>
               </w:rPr>
-              <w:t xml:space="preserve">Your profile opens in </w:t>
-            </w:r>
-            <w:r>
-              <w:rPr>
-                <w:rFonts w:ascii="Arial" w:cs="Arial" w:eastAsia="Arial" w:hAnsi="Arial"/>
-                <w:b/>
-                <w:bCs/>
-                <w:i w:val="false"/>
-                <w:iCs w:val="false"/>
-                <w:caps w:val="false"/>
-                <w:color w:val="6B7280"/>
-                <w:sz w:val="16"/>
-                <w:szCs w:val="16"/>
-              </w:rPr>
-              <w:t xml:space="preserve">one second.</w:t>
+              <w:t xml:space="preserve">One second. They see everything that matters about you.</w:t>
             </w:r>
           </w:p>
         </w:tc>
@@ -1570,7 +1598,35 @@
           <w:sz w:val="21"/>
           <w:szCs w:val="21"/>
         </w:rPr>
-        <w:t xml:space="preserve">Founders, executives, consultants, salespeople — anyone replacing the paper business card they hand out every week.</w:t>
+        <w:t xml:space="preserve">Founders, executives, consultants, salespeople, creators — anyone whose </w:t>
+      </w:r>
+      <w:r>
+        <w:rPr>
+          <w:rFonts w:ascii="Arial" w:cs="Arial" w:eastAsia="Arial" w:hAnsi="Arial"/>
+          <w:b/>
+          <w:bCs/>
+          <w:i w:val="false"/>
+          <w:iCs w:val="false"/>
+          <w:caps w:val="false"/>
+          <w:color w:val="1A1A1A"/>
+          <w:sz w:val="21"/>
+          <w:szCs w:val="21"/>
+        </w:rPr>
+        <w:t xml:space="preserve">first impression matters. </w:t>
+      </w:r>
+      <w:r>
+        <w:rPr>
+          <w:rFonts w:ascii="Arial" w:cs="Arial" w:eastAsia="Arial" w:hAnsi="Arial"/>
+          <w:b w:val="false"/>
+          <w:bCs w:val="false"/>
+          <w:i w:val="false"/>
+          <w:iCs w:val="false"/>
+          <w:caps w:val="false"/>
+          <w:color w:val="1A1A1A"/>
+          <w:sz w:val="21"/>
+          <w:szCs w:val="21"/>
+        </w:rPr>
+        <w:t xml:space="preserve">If you hand out a paper card every week, this replaces it permanently.</w:t>
       </w:r>
     </w:p>
     <w:p>
@@ -1680,7 +1736,7 @@
                 <w:sz w:val="19"/>
                 <w:szCs w:val="19"/>
               </w:rPr>
-              <w:t xml:space="preserve">One-time card purchase.</w:t>
+              <w:t xml:space="preserve">One-time. That is the whole cost.</w:t>
             </w:r>
           </w:p>
         </w:tc>
@@ -1717,7 +1773,7 @@
                 <w:sz w:val="18"/>
                 <w:szCs w:val="18"/>
               </w:rPr>
-              <w:t xml:space="preserve">No subscription. No recurring fee. </w:t>
+              <w:t xml:space="preserve">No subscription. No annual renewal. </w:t>
             </w:r>
             <w:r>
               <w:rPr>
@@ -1731,7 +1787,21 @@
                 <w:sz w:val="18"/>
                 <w:szCs w:val="18"/>
               </w:rPr>
-              <w:t xml:space="preserve">Lifetime profile hosting is included.</w:t>
+              <w:t xml:space="preserve">One card, one profile, hosted forever. </w:t>
+            </w:r>
+            <w:r>
+              <w:rPr>
+                <w:rFonts w:ascii="Arial" w:cs="Arial" w:eastAsia="Arial" w:hAnsi="Arial"/>
+                <w:b w:val="false"/>
+                <w:bCs w:val="false"/>
+                <w:i w:val="false"/>
+                <w:iCs w:val="false"/>
+                <w:caps w:val="false"/>
+                <w:color w:val="6B7280"/>
+                <w:sz w:val="18"/>
+                <w:szCs w:val="18"/>
+              </w:rPr>
+              <w:t xml:space="preserve">Update your page any time, from any device.</w:t>
             </w:r>
           </w:p>
         </w:tc>
@@ -1799,7 +1869,7 @@
           <w:sz w:val="21"/>
           <w:szCs w:val="21"/>
         </w:rPr>
-        <w:t xml:space="preserve">A sales platform that companies buy for their reps. It includes the same card and profile as the personal product, plus the tools that turn each meeting into a clean CRM lead </w:t>
+        <w:t xml:space="preserve">A full sales platform built around the same NFC card. Every rep gets a branded card and profile, and the software behind it turns each meeting into a clean CRM lead </w:t>
       </w:r>
       <w:r>
         <w:rPr>
@@ -1813,7 +1883,21 @@
           <w:sz w:val="21"/>
           <w:szCs w:val="21"/>
         </w:rPr>
-        <w:t xml:space="preserve">without any typing.</w:t>
+        <w:t xml:space="preserve">without any typing. </w:t>
+      </w:r>
+      <w:r>
+        <w:rPr>
+          <w:rFonts w:ascii="Arial" w:cs="Arial" w:eastAsia="Arial" w:hAnsi="Arial"/>
+          <w:b w:val="false"/>
+          <w:bCs w:val="false"/>
+          <w:i w:val="false"/>
+          <w:iCs w:val="false"/>
+          <w:caps w:val="false"/>
+          <w:color w:val="1A1A1A"/>
+          <w:sz w:val="21"/>
+          <w:szCs w:val="21"/>
+        </w:rPr>
+        <w:t xml:space="preserve">Sales heads see what is happening in the field, in real time, from real card activity — not from rep self-reports.</w:t>
       </w:r>
     </w:p>
     <w:p>
@@ -3565,7 +3649,7 @@
                 <w:sz w:val="16"/>
                 <w:szCs w:val="16"/>
               </w:rPr>
-              <w:t xml:space="preserve">Who buys it</w:t>
+              <w:t xml:space="preserve">Who it's for</w:t>
             </w:r>
           </w:p>
         </w:tc>
@@ -3679,7 +3763,7 @@
                 <w:sz w:val="16"/>
                 <w:szCs w:val="16"/>
               </w:rPr>
-              <w:t xml:space="preserve">Pieces included</w:t>
+              <w:t xml:space="preserve">What you get</w:t>
             </w:r>
           </w:p>
         </w:tc>
@@ -3716,7 +3800,7 @@
                 <w:sz w:val="19"/>
                 <w:szCs w:val="19"/>
               </w:rPr>
-              <w:t xml:space="preserve">Card + profile.</w:t>
+              <w:t xml:space="preserve">A matte-black NFC card and a personal web page.</w:t>
             </w:r>
           </w:p>
         </w:tc>
@@ -3753,7 +3837,7 @@
                 <w:sz w:val="19"/>
                 <w:szCs w:val="19"/>
               </w:rPr>
-              <w:t xml:space="preserve">Card + profile + voice-to-CRM + mobile app + admin dashboard + CRM integrations.</w:t>
+              <w:t xml:space="preserve">Branded NFC cards and profiles for every rep, plus voice-to-CRM, mobile app, admin dashboard and native CRM integrations.</w:t>
             </w:r>
           </w:p>
         </w:tc>
@@ -3793,7 +3877,7 @@
                 <w:sz w:val="16"/>
                 <w:szCs w:val="16"/>
               </w:rPr>
-              <w:t xml:space="preserve">Voice-to-CRM</w:t>
+              <w:t xml:space="preserve">Who owns the page</w:t>
             </w:r>
           </w:p>
         </w:tc>
@@ -3830,7 +3914,21 @@
                 <w:sz w:val="19"/>
                 <w:szCs w:val="19"/>
               </w:rPr>
-              <w:t xml:space="preserve">Not included.</w:t>
+              <w:t xml:space="preserve">You. </w:t>
+            </w:r>
+            <w:r>
+              <w:rPr>
+                <w:rFonts w:ascii="Arial" w:cs="Arial" w:eastAsia="Arial" w:hAnsi="Arial"/>
+                <w:b/>
+                <w:bCs/>
+                <w:i w:val="false"/>
+                <w:iCs w:val="false"/>
+                <w:caps w:val="false"/>
+                <w:color w:val="1A1A1A"/>
+                <w:sz w:val="19"/>
+                <w:szCs w:val="19"/>
+              </w:rPr>
+              <w:t xml:space="preserve">Edit it any time from your phone.</w:t>
             </w:r>
           </w:p>
         </w:tc>
@@ -3867,13 +3965,13 @@
                 <w:sz w:val="19"/>
                 <w:szCs w:val="19"/>
               </w:rPr>
-              <w:t xml:space="preserve">Yes.</w:t>
-            </w:r>
-            <w:r>
-              <w:rPr>
-                <w:rFonts w:ascii="Arial" w:cs="Arial" w:eastAsia="Arial" w:hAnsi="Arial"/>
-                <w:b w:val="false"/>
-                <w:bCs w:val="false"/>
+              <w:t xml:space="preserve">Your marketing team. </w:t>
+            </w:r>
+            <w:r>
+              <w:rPr>
+                <w:rFonts w:ascii="Arial" w:cs="Arial" w:eastAsia="Arial" w:hAnsi="Arial"/>
+                <w:b/>
+                <w:bCs/>
                 <w:i w:val="false"/>
                 <w:iCs w:val="false"/>
                 <w:caps w:val="false"/>
@@ -3881,7 +3979,7 @@
                 <w:sz w:val="19"/>
                 <w:szCs w:val="19"/>
               </w:rPr>
-              <w:t xml:space="preserve"> Rep talks for one minute after a meeting.</w:t>
+              <w:t xml:space="preserve">Locked, audited and revokable per rep.</w:t>
             </w:r>
           </w:p>
         </w:tc>
@@ -3921,7 +4019,7 @@
                 <w:sz w:val="16"/>
                 <w:szCs w:val="16"/>
               </w:rPr>
-              <w:t xml:space="preserve">Mobile app</w:t>
+              <w:t xml:space="preserve">What a tap does</w:t>
             </w:r>
           </w:p>
         </w:tc>
@@ -3958,7 +4056,21 @@
                 <w:sz w:val="19"/>
                 <w:szCs w:val="19"/>
               </w:rPr>
-              <w:t xml:space="preserve">Not included.</w:t>
+              <w:t xml:space="preserve">Opens your page. </w:t>
+            </w:r>
+            <w:r>
+              <w:rPr>
+                <w:rFonts w:ascii="Arial" w:cs="Arial" w:eastAsia="Arial" w:hAnsi="Arial"/>
+                <w:b/>
+                <w:bCs/>
+                <w:i w:val="false"/>
+                <w:iCs w:val="false"/>
+                <w:caps w:val="false"/>
+                <w:color w:val="1A1A1A"/>
+                <w:sz w:val="19"/>
+                <w:szCs w:val="19"/>
+              </w:rPr>
+              <w:t xml:space="preserve">They see your photo, video, story and a calendar button.</w:t>
             </w:r>
           </w:p>
         </w:tc>
@@ -3995,13 +4107,13 @@
                 <w:sz w:val="19"/>
                 <w:szCs w:val="19"/>
               </w:rPr>
-              <w:t xml:space="preserve">Yes.</w:t>
-            </w:r>
-            <w:r>
-              <w:rPr>
-                <w:rFonts w:ascii="Arial" w:cs="Arial" w:eastAsia="Arial" w:hAnsi="Arial"/>
-                <w:b w:val="false"/>
-                <w:bCs w:val="false"/>
+              <w:t xml:space="preserve">Opens the rep's page. </w:t>
+            </w:r>
+            <w:r>
+              <w:rPr>
+                <w:rFonts w:ascii="Arial" w:cs="Arial" w:eastAsia="Arial" w:hAnsi="Arial"/>
+                <w:b/>
+                <w:bCs/>
                 <w:i w:val="false"/>
                 <w:iCs w:val="false"/>
                 <w:caps w:val="false"/>
@@ -4009,7 +4121,7 @@
                 <w:sz w:val="19"/>
                 <w:szCs w:val="19"/>
               </w:rPr>
-              <w:t xml:space="preserve"> Reps see every past meeting with every customer.</w:t>
+              <w:t xml:space="preserve">The rep then talks for one minute and a structured lead lands in your CRM.</w:t>
             </w:r>
           </w:p>
         </w:tc>
@@ -4049,7 +4161,7 @@
                 <w:sz w:val="16"/>
                 <w:szCs w:val="16"/>
               </w:rPr>
-              <w:t xml:space="preserve">Admin dashboard</w:t>
+              <w:t xml:space="preserve">Best for</w:t>
             </w:r>
           </w:p>
         </w:tc>
@@ -4086,7 +4198,21 @@
                 <w:sz w:val="19"/>
                 <w:szCs w:val="19"/>
               </w:rPr>
-              <w:t xml:space="preserve">Not included.</w:t>
+              <w:t xml:space="preserve">First-impression power. </w:t>
+            </w:r>
+            <w:r>
+              <w:rPr>
+                <w:rFonts w:ascii="Arial" w:cs="Arial" w:eastAsia="Arial" w:hAnsi="Arial"/>
+                <w:b/>
+                <w:bCs/>
+                <w:i w:val="false"/>
+                <w:iCs w:val="false"/>
+                <w:caps w:val="false"/>
+                <w:color w:val="1A1A1A"/>
+                <w:sz w:val="19"/>
+                <w:szCs w:val="19"/>
+              </w:rPr>
+              <w:t xml:space="preserve">Personal brand.</w:t>
             </w:r>
           </w:p>
         </w:tc>
@@ -4123,13 +4249,13 @@
                 <w:sz w:val="19"/>
                 <w:szCs w:val="19"/>
               </w:rPr>
-              <w:t xml:space="preserve">Yes.</w:t>
-            </w:r>
-            <w:r>
-              <w:rPr>
-                <w:rFonts w:ascii="Arial" w:cs="Arial" w:eastAsia="Arial" w:hAnsi="Arial"/>
-                <w:b w:val="false"/>
-                <w:bCs w:val="false"/>
+              <w:t xml:space="preserve">Pipeline visibility. Field accountability. </w:t>
+            </w:r>
+            <w:r>
+              <w:rPr>
+                <w:rFonts w:ascii="Arial" w:cs="Arial" w:eastAsia="Arial" w:hAnsi="Arial"/>
+                <w:b/>
+                <w:bCs/>
                 <w:i w:val="false"/>
                 <w:iCs w:val="false"/>
                 <w:caps w:val="false"/>
@@ -4137,7 +4263,7 @@
                 <w:sz w:val="19"/>
                 <w:szCs w:val="19"/>
               </w:rPr>
-              <w:t xml:space="preserve"> Pipeline, taps, leads, top performers.</w:t>
+              <w:t xml:space="preserve">CRM hygiene without typing.</w:t>
             </w:r>
           </w:p>
         </w:tc>
@@ -4177,7 +4303,7 @@
                 <w:sz w:val="16"/>
                 <w:szCs w:val="16"/>
               </w:rPr>
-              <w:t xml:space="preserve">CRM sync</w:t>
+              <w:t xml:space="preserve">Price</w:t>
             </w:r>
           </w:p>
         </w:tc>
@@ -4205,6 +4331,20 @@
             <w:r>
               <w:rPr>
                 <w:rFonts w:ascii="Arial" w:cs="Arial" w:eastAsia="Arial" w:hAnsi="Arial"/>
+                <w:b/>
+                <w:bCs/>
+                <w:i w:val="false"/>
+                <w:iCs w:val="false"/>
+                <w:caps w:val="false"/>
+                <w:color w:val="1A1A1A"/>
+                <w:sz w:val="19"/>
+                <w:szCs w:val="19"/>
+              </w:rPr>
+              <w:t xml:space="preserve">₹3,500.</w:t>
+            </w:r>
+            <w:r>
+              <w:rPr>
+                <w:rFonts w:ascii="Arial" w:cs="Arial" w:eastAsia="Arial" w:hAnsi="Arial"/>
                 <w:b w:val="false"/>
                 <w:bCs w:val="false"/>
                 <w:i w:val="false"/>
@@ -4214,7 +4354,7 @@
                 <w:sz w:val="19"/>
                 <w:szCs w:val="19"/>
               </w:rPr>
-              <w:t xml:space="preserve">Not included.</w:t>
+              <w:t xml:space="preserve"> One-time, total.</w:t>
             </w:r>
           </w:p>
         </w:tc>
@@ -4251,7 +4391,21 @@
                 <w:sz w:val="19"/>
                 <w:szCs w:val="19"/>
               </w:rPr>
-              <w:t xml:space="preserve">Salesforce, HubSpot, Zoho, Odoo.</w:t>
+              <w:t xml:space="preserve">₹3,000 per seat per month.</w:t>
+            </w:r>
+            <w:r>
+              <w:rPr>
+                <w:rFonts w:ascii="Arial" w:cs="Arial" w:eastAsia="Arial" w:hAnsi="Arial"/>
+                <w:b w:val="false"/>
+                <w:bCs w:val="false"/>
+                <w:i w:val="false"/>
+                <w:iCs w:val="false"/>
+                <w:caps w:val="false"/>
+                <w:color w:val="1A1A1A"/>
+                <w:sz w:val="19"/>
+                <w:szCs w:val="19"/>
+              </w:rPr>
+              <w:t xml:space="preserve"> Billed annually.</w:t>
             </w:r>
           </w:p>
         </w:tc>
@@ -4291,7 +4445,7 @@
                 <w:sz w:val="16"/>
                 <w:szCs w:val="16"/>
               </w:rPr>
-              <w:t xml:space="preserve">Brand control</w:t>
+              <w:t xml:space="preserve">Renews</w:t>
             </w:r>
           </w:p>
         </w:tc>
@@ -4328,7 +4482,21 @@
                 <w:sz w:val="19"/>
                 <w:szCs w:val="19"/>
               </w:rPr>
-              <w:t xml:space="preserve">Your own personal profile.</w:t>
+              <w:t xml:space="preserve">Never. </w:t>
+            </w:r>
+            <w:r>
+              <w:rPr>
+                <w:rFonts w:ascii="Arial" w:cs="Arial" w:eastAsia="Arial" w:hAnsi="Arial"/>
+                <w:b/>
+                <w:bCs/>
+                <w:i w:val="false"/>
+                <w:iCs w:val="false"/>
+                <w:caps w:val="false"/>
+                <w:color w:val="1A1A1A"/>
+                <w:sz w:val="19"/>
+                <w:szCs w:val="19"/>
+              </w:rPr>
+              <w:t xml:space="preserve">Hosting is included forever.</w:t>
             </w:r>
           </w:p>
         </w:tc>
@@ -4365,7 +4533,21 @@
                 <w:sz w:val="19"/>
                 <w:szCs w:val="19"/>
               </w:rPr>
-              <w:t xml:space="preserve">Locked to company brand. Audit and revoke per rep.</w:t>
+              <w:t xml:space="preserve">Yearly. </w:t>
+            </w:r>
+            <w:r>
+              <w:rPr>
+                <w:rFonts w:ascii="Arial" w:cs="Arial" w:eastAsia="Arial" w:hAnsi="Arial"/>
+                <w:b/>
+                <w:bCs/>
+                <w:i w:val="false"/>
+                <w:iCs w:val="false"/>
+                <w:caps w:val="false"/>
+                <w:color w:val="1A1A1A"/>
+                <w:sz w:val="19"/>
+                <w:szCs w:val="19"/>
+              </w:rPr>
+              <w:t xml:space="preserve">Add or remove seats as people join or leave.</w:t>
             </w:r>
           </w:p>
         </w:tc>
@@ -4405,7 +4587,7 @@
                 <w:sz w:val="16"/>
                 <w:szCs w:val="16"/>
               </w:rPr>
-              <w:t xml:space="preserve">Price</w:t>
+              <w:t xml:space="preserve">Setup</w:t>
             </w:r>
           </w:p>
         </w:tc>
@@ -4433,20 +4615,6 @@
             <w:r>
               <w:rPr>
                 <w:rFonts w:ascii="Arial" w:cs="Arial" w:eastAsia="Arial" w:hAnsi="Arial"/>
-                <w:b/>
-                <w:bCs/>
-                <w:i w:val="false"/>
-                <w:iCs w:val="false"/>
-                <w:caps w:val="false"/>
-                <w:color w:val="1A1A1A"/>
-                <w:sz w:val="19"/>
-                <w:szCs w:val="19"/>
-              </w:rPr>
-              <w:t xml:space="preserve">₹3,500.</w:t>
-            </w:r>
-            <w:r>
-              <w:rPr>
-                <w:rFonts w:ascii="Arial" w:cs="Arial" w:eastAsia="Arial" w:hAnsi="Arial"/>
                 <w:b w:val="false"/>
                 <w:bCs w:val="false"/>
                 <w:i w:val="false"/>
@@ -4456,7 +4624,7 @@
                 <w:sz w:val="19"/>
                 <w:szCs w:val="19"/>
               </w:rPr>
-              <w:t xml:space="preserve"> One-time.</w:t>
+              <w:t xml:space="preserve">Buy the card. Build your page. Hand it out.</w:t>
             </w:r>
           </w:p>
         </w:tc>
@@ -4484,20 +4652,6 @@
             <w:r>
               <w:rPr>
                 <w:rFonts w:ascii="Arial" w:cs="Arial" w:eastAsia="Arial" w:hAnsi="Arial"/>
-                <w:b/>
-                <w:bCs/>
-                <w:i w:val="false"/>
-                <w:iCs w:val="false"/>
-                <w:caps w:val="false"/>
-                <w:color w:val="1A1A1A"/>
-                <w:sz w:val="19"/>
-                <w:szCs w:val="19"/>
-              </w:rPr>
-              <w:t xml:space="preserve">₹3,000 per seat per month.</w:t>
-            </w:r>
-            <w:r>
-              <w:rPr>
-                <w:rFonts w:ascii="Arial" w:cs="Arial" w:eastAsia="Arial" w:hAnsi="Arial"/>
                 <w:b w:val="false"/>
                 <w:bCs w:val="false"/>
                 <w:i w:val="false"/>
@@ -4507,121 +4661,7 @@
                 <w:sz w:val="19"/>
                 <w:szCs w:val="19"/>
               </w:rPr>
-              <w:t xml:space="preserve"> Billed annually.</w:t>
-            </w:r>
-          </w:p>
-        </w:tc>
-      </w:tr>
-      <w:tr>
-        <w:tc>
-          <w:tcPr>
-            <w:tcW w:type="dxa" w:w="1800"/>
-            <w:tcBorders>
-              <w:top w:val="single" w:color="EEF1F6" w:sz="4"/>
-              <w:left w:val="single" w:color="E2E8F0" w:sz="4"/>
-              <w:bottom w:val="single" w:color="EEF1F6" w:sz="4"/>
-              <w:right w:val="single" w:color="E2E8F0" w:sz="4"/>
-            </w:tcBorders>
-            <w:shd w:fill="F7F9FC" w:color="auto" w:val="clear"/>
-            <w:tcMar>
-              <w:top w:type="dxa" w:w="160"/>
-              <w:left w:type="dxa" w:w="240"/>
-              <w:bottom w:type="dxa" w:w="160"/>
-              <w:right w:type="dxa" w:w="240"/>
-            </w:tcMar>
-            <w:vAlign w:val="center"/>
-          </w:tcPr>
-          <w:p>
-            <w:pPr>
-              <w:spacing w:after="0" w:before="0"/>
-            </w:pPr>
-            <w:r>
-              <w:rPr>
-                <w:rFonts w:ascii="Arial" w:cs="Arial" w:eastAsia="Arial" w:hAnsi="Arial"/>
-                <w:b/>
-                <w:bCs/>
-                <w:i w:val="false"/>
-                <w:iCs w:val="false"/>
-                <w:caps/>
-                <w:color w:val="6B7280"/>
-                <w:sz w:val="16"/>
-                <w:szCs w:val="16"/>
-              </w:rPr>
-              <w:t xml:space="preserve">Setup</w:t>
-            </w:r>
-          </w:p>
-        </w:tc>
-        <w:tc>
-          <w:tcPr>
-            <w:tcW w:type="dxa" w:w="3973"/>
-            <w:tcBorders>
-              <w:top w:val="single" w:color="EEF1F6" w:sz="4"/>
-              <w:left w:val="single" w:color="E2E8F0" w:sz="4"/>
-              <w:bottom w:val="single" w:color="EEF1F6" w:sz="4"/>
-              <w:right w:val="single" w:color="E2E8F0" w:sz="4"/>
-            </w:tcBorders>
-            <w:tcMar>
-              <w:top w:type="dxa" w:w="160"/>
-              <w:left w:type="dxa" w:w="240"/>
-              <w:bottom w:type="dxa" w:w="160"/>
-              <w:right w:type="dxa" w:w="240"/>
-            </w:tcMar>
-            <w:vAlign w:val="center"/>
-          </w:tcPr>
-          <w:p>
-            <w:pPr>
-              <w:spacing w:after="0" w:before="0" w:line="260"/>
-            </w:pPr>
-            <w:r>
-              <w:rPr>
-                <w:rFonts w:ascii="Arial" w:cs="Arial" w:eastAsia="Arial" w:hAnsi="Arial"/>
-                <w:b w:val="false"/>
-                <w:bCs w:val="false"/>
-                <w:i w:val="false"/>
-                <w:iCs w:val="false"/>
-                <w:caps w:val="false"/>
-                <w:color w:val="1A1A1A"/>
-                <w:sz w:val="19"/>
-                <w:szCs w:val="19"/>
-              </w:rPr>
-              <w:t xml:space="preserve">Buy card. Build profile. Hand it out.</w:t>
-            </w:r>
-          </w:p>
-        </w:tc>
-        <w:tc>
-          <w:tcPr>
-            <w:tcW w:type="dxa" w:w="3973"/>
-            <w:tcBorders>
-              <w:top w:val="single" w:color="EEF1F6" w:sz="4"/>
-              <w:left w:val="single" w:color="E2E8F0" w:sz="4"/>
-              <w:bottom w:val="single" w:color="EEF1F6" w:sz="4"/>
-              <w:right w:val="single" w:color="E2E8F0" w:sz="4"/>
-            </w:tcBorders>
-            <w:tcMar>
-              <w:top w:type="dxa" w:w="160"/>
-              <w:left w:type="dxa" w:w="240"/>
-              <w:bottom w:type="dxa" w:w="160"/>
-              <w:right w:type="dxa" w:w="240"/>
-            </w:tcMar>
-            <w:vAlign w:val="center"/>
-          </w:tcPr>
-          <w:p>
-            <w:pPr>
-              <w:spacing w:after="0" w:before="0" w:line="260"/>
-            </w:pPr>
-            <w:r>
-              <w:rPr>
-                <w:rFonts w:ascii="Arial" w:cs="Arial" w:eastAsia="Arial" w:hAnsi="Arial"/>
-                <w:b w:val="false"/>
-                <w:bCs w:val="false"/>
-                <w:i w:val="false"/>
-                <w:iCs w:val="false"/>
-                <w:caps w:val="false"/>
-                <w:color w:val="1A1A1A"/>
-                <w:sz w:val="19"/>
-                <w:szCs w:val="19"/>
-              </w:rPr>
-              <w:t xml:space="preserve">Onboard reps. Ship cards. Connect CRM.</w:t>
+              <w:t xml:space="preserve">Onboard reps. Ship cards. Connect your CRM.</w:t>
             </w:r>
           </w:p>
         </w:tc>

</xml_diff>

<commit_message>
Remove AI tells, simplify copy
</commit_message>
<xml_diff>
--- a/AceCard_Two_Products.docx
+++ b/AceCard_Two_Products.docx
@@ -108,7 +108,7 @@
                 <w:sz w:val="22"/>
                 <w:szCs w:val="22"/>
               </w:rPr>
-              <w:t xml:space="preserve">AceCard runs two separate products under one brand. </w:t>
+              <w:t xml:space="preserve">AceCard sells two different products. </w:t>
             </w:r>
             <w:r>
               <w:rPr>
@@ -122,7 +122,7 @@
                 <w:sz w:val="22"/>
                 <w:szCs w:val="22"/>
               </w:rPr>
-              <w:t xml:space="preserve">The Ace Smart Card</w:t>
+              <w:t xml:space="preserve">The first, called the Ace Smart Card, </w:t>
             </w:r>
             <w:r>
               <w:rPr>
@@ -136,7 +136,7 @@
                 <w:sz w:val="22"/>
                 <w:szCs w:val="22"/>
               </w:rPr>
-              <w:t xml:space="preserve"> is a premium digital business card individuals buy for themselves. </w:t>
+              <w:t xml:space="preserve">is a digital business card individuals buy for themselves. </w:t>
             </w:r>
             <w:r>
               <w:rPr>
@@ -150,7 +150,7 @@
                 <w:sz w:val="22"/>
                 <w:szCs w:val="22"/>
               </w:rPr>
-              <w:t xml:space="preserve">AceCard</w:t>
+              <w:t xml:space="preserve">The second, called AceCard, </w:t>
             </w:r>
             <w:r>
               <w:rPr>
@@ -164,7 +164,7 @@
                 <w:sz w:val="22"/>
                 <w:szCs w:val="22"/>
               </w:rPr>
-              <w:t xml:space="preserve"> is a full sales platform companies buy for their reps. This document explains what each one includes, how it works, and what it costs.</w:t>
+              <w:t xml:space="preserve">is a sales platform companies buy for their reps. The rest of this document explains each one in detail, with pricing.</w:t>
             </w:r>
           </w:p>
         </w:tc>
@@ -224,7 +224,7 @@
           <w:sz w:val="19"/>
           <w:szCs w:val="19"/>
         </w:rPr>
-        <w:t xml:space="preserve">Same brand. Same NFC card behind both. What the software wrapped around the card does is what changes.</w:t>
+        <w:t xml:space="preserve">The same physical NFC card sits inside both products. The difference is the software around it and who it is sold to.</w:t>
       </w:r>
     </w:p>
     <w:p>
@@ -367,7 +367,7 @@
                       <w:sz w:val="19"/>
                       <w:szCs w:val="19"/>
                     </w:rPr>
-                    <w:t xml:space="preserve">A premium digital business card. Yours forever.</w:t>
+                    <w:t xml:space="preserve">A digital business card you set up once and own.</w:t>
                   </w:r>
                 </w:p>
               </w:tc>
@@ -425,7 +425,7 @@
                       <w:sz w:val="19"/>
                       <w:szCs w:val="19"/>
                     </w:rPr>
-                    <w:t xml:space="preserve">An individual — founders, executives, consultants, anyone whose first impression matters.</w:t>
+                    <w:t xml:space="preserve">An individual.</w:t>
                   </w:r>
                 </w:p>
                 <w:p>
@@ -463,7 +463,7 @@
                       <w:sz w:val="19"/>
                       <w:szCs w:val="19"/>
                     </w:rPr>
-                    <w:t xml:space="preserve">A matte-black NFC card and a personal web page with your photo, video, social, portfolio and calendar.</w:t>
+                    <w:t xml:space="preserve">An NFC card and a personal web page. The page can show a photo, a video, your bio, your social links, and a calendar button.</w:t>
                   </w:r>
                 </w:p>
                 <w:p>
@@ -501,7 +501,7 @@
                       <w:sz w:val="19"/>
                       <w:szCs w:val="19"/>
                     </w:rPr>
-                    <w:t xml:space="preserve">₹3,500. Pay once. Use it forever — including the hosting.</w:t>
+                    <w:t xml:space="preserve">₹3,500. Paid once. Hosting included.</w:t>
                   </w:r>
                 </w:p>
                 <w:p>
@@ -667,7 +667,7 @@
                       <w:sz w:val="19"/>
                       <w:szCs w:val="19"/>
                     </w:rPr>
-                    <w:t xml:space="preserve">A full sales platform built around the card.</w:t>
+                    <w:t xml:space="preserve">A sales platform that uses the same NFC card.</w:t>
                   </w:r>
                 </w:p>
               </w:tc>
@@ -725,7 +725,7 @@
                       <w:sz w:val="19"/>
                       <w:szCs w:val="19"/>
                     </w:rPr>
-                    <w:t xml:space="preserve">A sales team. From 10 to 1,000+ reps.</w:t>
+                    <w:t xml:space="preserve">A sales team, 10 to 1,000+ reps.</w:t>
                   </w:r>
                 </w:p>
                 <w:p>
@@ -763,7 +763,7 @@
                       <w:sz w:val="19"/>
                       <w:szCs w:val="19"/>
                     </w:rPr>
-                    <w:t xml:space="preserve">Branded cards and profiles for every rep, plus voice-to-CRM, a mobile app, an admin dashboard and native CRM integrations.</w:t>
+                    <w:t xml:space="preserve">Branded cards and profiles for every rep, voice-to-CRM, a mobile app for reps, a dashboard for sales heads, and integrations to Salesforce, HubSpot, Zoho and Odoo.</w:t>
                   </w:r>
                 </w:p>
                 <w:p>
@@ -892,7 +892,7 @@
           <w:sz w:val="21"/>
           <w:szCs w:val="21"/>
         </w:rPr>
-        <w:t xml:space="preserve">A premium NFC business card paired with a personal web page. Hand it to someone, they tap it on their phone, and the page opens — your photo, your video, your story, your work, and a calendar button to book time with you. </w:t>
+        <w:t xml:space="preserve">An NFC card and a personal web page. Hand the card to someone, they tap it against their phone, and the page opens. The page can include a photo, a video that plays inline, your bio, links to your work, your social handles, and a button that books a meeting on your calendar. The recipient does not need an app or a QR code, and you do not collect their email. The card is a </w:t>
       </w:r>
       <w:r>
         <w:rPr>
@@ -906,13 +906,13 @@
           <w:sz w:val="21"/>
           <w:szCs w:val="21"/>
         </w:rPr>
-        <w:t xml:space="preserve">No app to download. No QR to scan. No email asked. </w:t>
+        <w:t xml:space="preserve">one-time purchase</w:t>
       </w:r>
       <w:r>
         <w:rPr>
           <w:rFonts w:ascii="Arial" w:cs="Arial" w:eastAsia="Arial" w:hAnsi="Arial"/>
-          <w:b/>
-          <w:bCs/>
+          <w:b w:val="false"/>
+          <w:bCs w:val="false"/>
           <w:i w:val="false"/>
           <w:iCs w:val="false"/>
           <w:caps w:val="false"/>
@@ -920,7 +920,7 @@
           <w:sz w:val="21"/>
           <w:szCs w:val="21"/>
         </w:rPr>
-        <w:t xml:space="preserve">Pay once, use it for life.</w:t>
+        <w:t xml:space="preserve">; page hosting is included after that, with no recurring fee.</w:t>
       </w:r>
     </w:p>
     <w:p>
@@ -1050,7 +1050,7 @@
                 <w:sz w:val="19"/>
                 <w:szCs w:val="19"/>
               </w:rPr>
-              <w:t xml:space="preserve">Sleek, premium card with an NFC chip inside. </w:t>
+              <w:t xml:space="preserve">A plastic card with an NFC chip embedded inside. There is no logo or other branding printed on either face. To open the page, the recipient holds the card against their phone — iPhones detect it through the top of the screen, Android phones through the back. </w:t>
             </w:r>
             <w:r>
               <w:rPr>
@@ -1064,7 +1064,7 @@
                 <w:sz w:val="19"/>
                 <w:szCs w:val="19"/>
               </w:rPr>
-              <w:t xml:space="preserve">No company logo. No expiry. </w:t>
+              <w:t xml:space="preserve">The same card can be used indefinitely; </w:t>
             </w:r>
             <w:r>
               <w:rPr>
@@ -1078,7 +1078,7 @@
                 <w:sz w:val="19"/>
                 <w:szCs w:val="19"/>
               </w:rPr>
-              <w:t xml:space="preserve">iPhone reads it from the front camera. Android reads it from the back. Holds up tens of thousands of taps — one card is built to last as long as you do.</w:t>
+              <w:t xml:space="preserve">the chip does not need a battery or recharging.</w:t>
             </w:r>
           </w:p>
         </w:tc>
@@ -1175,7 +1175,7 @@
                 <w:sz w:val="19"/>
                 <w:szCs w:val="19"/>
               </w:rPr>
-              <w:t xml:space="preserve">A real, full-page website — not a list of links. </w:t>
+              <w:t xml:space="preserve">A web page hosted at your own AceCard URL. It is built from blocks you arrange yourself — a header with your photo, a featured video that plays inline, a written bio, links to anything you want to feature (portfolio, podcast, press), your social handles, and a 'Book a call' button connected to your calendar. </w:t>
             </w:r>
             <w:r>
               <w:rPr>
@@ -1189,7 +1189,7 @@
                 <w:sz w:val="19"/>
                 <w:szCs w:val="19"/>
               </w:rPr>
-              <w:t xml:space="preserve">Put anything on it: </w:t>
+              <w:t xml:space="preserve">You can rearrange blocks and edit the content from your phone </w:t>
             </w:r>
             <w:r>
               <w:rPr>
@@ -1203,7 +1203,7 @@
                 <w:sz w:val="19"/>
                 <w:szCs w:val="19"/>
               </w:rPr>
-              <w:t xml:space="preserve">your photo, a featured video that plays inline, your story, your portfolio, your podcast, your social handles, a 'book a call' button that opens your calendar. Drag and drop blocks in any order. Update it any time from your phone. No watermarks, no other brand on your page.</w:t>
+              <w:t xml:space="preserve">at any time. The page carries no AceCard branding.</w:t>
             </w:r>
           </w:p>
         </w:tc>
@@ -1300,7 +1300,7 @@
                 <w:sz w:val="19"/>
                 <w:szCs w:val="19"/>
               </w:rPr>
-              <w:t xml:space="preserve">Build your page</w:t>
+              <w:t xml:space="preserve">Build the page</w:t>
             </w:r>
           </w:p>
           <w:p>
@@ -1319,21 +1319,7 @@
                 <w:sz w:val="16"/>
                 <w:szCs w:val="16"/>
               </w:rPr>
-              <w:t xml:space="preserve">Add your photo, video, links, calendar. </w:t>
-            </w:r>
-            <w:r>
-              <w:rPr>
-                <w:rFonts w:ascii="Arial" w:cs="Arial" w:eastAsia="Arial" w:hAnsi="Arial"/>
-                <w:b/>
-                <w:bCs/>
-                <w:i w:val="false"/>
-                <w:iCs w:val="false"/>
-                <w:caps w:val="false"/>
-                <w:color w:val="6B7280"/>
-                <w:sz w:val="16"/>
-                <w:szCs w:val="16"/>
-              </w:rPr>
-              <w:t xml:space="preserve">Takes ten minutes.</w:t>
+              <w:t xml:space="preserve">Add a photo, a bio, links, and your calendar.</w:t>
             </w:r>
           </w:p>
         </w:tc>
@@ -1426,7 +1412,7 @@
                 <w:sz w:val="19"/>
                 <w:szCs w:val="19"/>
               </w:rPr>
-              <w:t xml:space="preserve">Hand someone the card</w:t>
+              <w:t xml:space="preserve">Give out the card</w:t>
             </w:r>
           </w:p>
           <w:p>
@@ -1445,7 +1431,7 @@
                 <w:sz w:val="16"/>
                 <w:szCs w:val="16"/>
               </w:rPr>
-              <w:t xml:space="preserve">Meetings, events, lunch — anywhere you'd use paper.</w:t>
+              <w:t xml:space="preserve">In person, at meetings or events.</w:t>
             </w:r>
           </w:p>
         </w:tc>
@@ -1538,7 +1524,7 @@
                 <w:sz w:val="19"/>
                 <w:szCs w:val="19"/>
               </w:rPr>
-              <w:t xml:space="preserve">They tap. Page opens.</w:t>
+              <w:t xml:space="preserve">They tap it</w:t>
             </w:r>
           </w:p>
           <w:p>
@@ -1557,7 +1543,7 @@
                 <w:sz w:val="16"/>
                 <w:szCs w:val="16"/>
               </w:rPr>
-              <w:t xml:space="preserve">One second. They see everything that matters about you.</w:t>
+              <w:t xml:space="preserve">Their phone opens your page in about a second.</w:t>
             </w:r>
           </w:p>
         </w:tc>
@@ -1598,35 +1584,7 @@
           <w:sz w:val="21"/>
           <w:szCs w:val="21"/>
         </w:rPr>
-        <w:t xml:space="preserve">Founders, executives, consultants, salespeople, creators — anyone whose </w:t>
-      </w:r>
-      <w:r>
-        <w:rPr>
-          <w:rFonts w:ascii="Arial" w:cs="Arial" w:eastAsia="Arial" w:hAnsi="Arial"/>
-          <w:b/>
-          <w:bCs/>
-          <w:i w:val="false"/>
-          <w:iCs w:val="false"/>
-          <w:caps w:val="false"/>
-          <w:color w:val="1A1A1A"/>
-          <w:sz w:val="21"/>
-          <w:szCs w:val="21"/>
-        </w:rPr>
-        <w:t xml:space="preserve">first impression matters. </w:t>
-      </w:r>
-      <w:r>
-        <w:rPr>
-          <w:rFonts w:ascii="Arial" w:cs="Arial" w:eastAsia="Arial" w:hAnsi="Arial"/>
-          <w:b w:val="false"/>
-          <w:bCs w:val="false"/>
-          <w:i w:val="false"/>
-          <w:iCs w:val="false"/>
-          <w:caps w:val="false"/>
-          <w:color w:val="1A1A1A"/>
-          <w:sz w:val="21"/>
-          <w:szCs w:val="21"/>
-        </w:rPr>
-        <w:t xml:space="preserve">If you hand out a paper card every week, this replaces it permanently.</w:t>
+        <w:t xml:space="preserve">People who give out business cards often — founders, consultants, salespeople, executives, freelancers. The Ace Smart Card replaces the paper card. When your details change (such as a new role or phone number), you update the page and the change is live immediately. There is no need to reprint and reorder cards.</w:t>
       </w:r>
     </w:p>
     <w:p>
@@ -1736,7 +1694,7 @@
                 <w:sz w:val="19"/>
                 <w:szCs w:val="19"/>
               </w:rPr>
-              <w:t xml:space="preserve">One-time. That is the whole cost.</w:t>
+              <w:t xml:space="preserve">One-time payment for the card.</w:t>
             </w:r>
           </w:p>
         </w:tc>
@@ -1773,7 +1731,7 @@
                 <w:sz w:val="18"/>
                 <w:szCs w:val="18"/>
               </w:rPr>
-              <w:t xml:space="preserve">No subscription. No annual renewal. </w:t>
+              <w:t xml:space="preserve">There is no subscription or renewal. </w:t>
             </w:r>
             <w:r>
               <w:rPr>
@@ -1787,7 +1745,7 @@
                 <w:sz w:val="18"/>
                 <w:szCs w:val="18"/>
               </w:rPr>
-              <w:t xml:space="preserve">One card, one profile, hosted forever. </w:t>
+              <w:t xml:space="preserve">Page hosting is included </w:t>
             </w:r>
             <w:r>
               <w:rPr>
@@ -1801,7 +1759,7 @@
                 <w:sz w:val="18"/>
                 <w:szCs w:val="18"/>
               </w:rPr>
-              <w:t xml:space="preserve">Update your page any time, from any device.</w:t>
+              <w:t xml:space="preserve">at no extra cost, and the page can be edited any time.</w:t>
             </w:r>
           </w:p>
         </w:tc>
@@ -1869,7 +1827,7 @@
           <w:sz w:val="21"/>
           <w:szCs w:val="21"/>
         </w:rPr>
-        <w:t xml:space="preserve">A full sales platform built around the same NFC card. Every rep gets a branded card and profile, and the software behind it turns each meeting into a clean CRM lead </w:t>
+        <w:t xml:space="preserve">A sales platform that uses the same NFC card. Every rep receives a card and a profile carrying the company brand. After each meeting, the rep captures the lead by </w:t>
       </w:r>
       <w:r>
         <w:rPr>
@@ -1883,7 +1841,7 @@
           <w:sz w:val="21"/>
           <w:szCs w:val="21"/>
         </w:rPr>
-        <w:t xml:space="preserve">without any typing. </w:t>
+        <w:t xml:space="preserve">speaking into the AceCard app </w:t>
       </w:r>
       <w:r>
         <w:rPr>
@@ -1897,7 +1855,7 @@
           <w:sz w:val="21"/>
           <w:szCs w:val="21"/>
         </w:rPr>
-        <w:t xml:space="preserve">Sales heads see what is happening in the field, in real time, from real card activity — not from rep self-reports.</w:t>
+        <w:t xml:space="preserve">instead of typing it into a form. Sales managers see field activity directly from card taps, without waiting for reps to log it themselves.</w:t>
       </w:r>
     </w:p>
     <w:p>
@@ -2027,7 +1985,7 @@
                 <w:sz w:val="19"/>
                 <w:szCs w:val="19"/>
               </w:rPr>
-              <w:t xml:space="preserve">Same card as the personal product, but </w:t>
+              <w:t xml:space="preserve">The same NFC card as in the Smart Card product. The marketing team controls the entire page — banner, logo, colors and layout — for every rep on the team. </w:t>
             </w:r>
             <w:r>
               <w:rPr>
@@ -2041,7 +1999,7 @@
                 <w:sz w:val="19"/>
                 <w:szCs w:val="19"/>
               </w:rPr>
-              <w:t xml:space="preserve">every rep's card carries the company banner. </w:t>
+              <w:t xml:space="preserve">When a rep leaves, the link is revoked </w:t>
             </w:r>
             <w:r>
               <w:rPr>
@@ -2055,7 +2013,7 @@
                 <w:sz w:val="19"/>
                 <w:szCs w:val="19"/>
               </w:rPr>
-              <w:t xml:space="preserve">Marketing controls what shows. Pull a card back the day someone leaves.</w:t>
+              <w:t xml:space="preserve">and the card stops opening any page.</w:t>
             </w:r>
           </w:p>
         </w:tc>
@@ -2133,7 +2091,7 @@
                 <w:sz w:val="22"/>
                 <w:szCs w:val="22"/>
               </w:rPr>
-              <w:t xml:space="preserve">Team-managed profiles</w:t>
+              <w:t xml:space="preserve">Centrally managed profiles</w:t>
             </w:r>
           </w:p>
           <w:p>
@@ -2152,7 +2110,7 @@
                 <w:sz w:val="19"/>
                 <w:szCs w:val="19"/>
               </w:rPr>
-              <w:t xml:space="preserve">Same profile, governed centrally. Lock the company brand across every rep. Audit any rep's page. </w:t>
+              <w:t xml:space="preserve">Each rep's page is built from a template the company controls. Administrators can audit any rep's page and push updates centrally — for instance, a new product launch or a refreshed case study. </w:t>
             </w:r>
             <w:r>
               <w:rPr>
@@ -2166,7 +2124,7 @@
                 <w:sz w:val="19"/>
                 <w:szCs w:val="19"/>
               </w:rPr>
-              <w:t xml:space="preserve">Revoke remotely on exit.</w:t>
+              <w:t xml:space="preserve">Access is removed when a rep leaves the team.</w:t>
             </w:r>
           </w:p>
         </w:tc>
@@ -2244,7 +2202,7 @@
                 <w:sz w:val="22"/>
                 <w:szCs w:val="22"/>
               </w:rPr>
-              <w:t xml:space="preserve">Voice-to-CRM</w:t>
+              <w:t xml:space="preserve">Voice-to-CRM capture</w:t>
             </w:r>
           </w:p>
           <w:p>
@@ -2263,7 +2221,7 @@
                 <w:sz w:val="19"/>
                 <w:szCs w:val="19"/>
               </w:rPr>
-              <w:t xml:space="preserve">Right after a meeting, the rep </w:t>
+              <w:t xml:space="preserve">Right after a meeting, the rep opens the app and answers a few short questions out loud — typically taking </w:t>
             </w:r>
             <w:r>
               <w:rPr>
@@ -2277,7 +2235,7 @@
                 <w:sz w:val="19"/>
                 <w:szCs w:val="19"/>
               </w:rPr>
-              <w:t xml:space="preserve">talks for one minute. </w:t>
+              <w:t xml:space="preserve">about a minute. </w:t>
             </w:r>
             <w:r>
               <w:rPr>
@@ -2291,7 +2249,7 @@
                 <w:sz w:val="19"/>
                 <w:szCs w:val="19"/>
               </w:rPr>
-              <w:t xml:space="preserve">The app pulls out the lead name, role, company, deal size and next step, and pushes it to your CRM. No forms, no typing.</w:t>
+              <w:t xml:space="preserve">The app converts the spoken answer into structured CRM fields (lead name, role, company, deal size, next step) and pushes the record into your CRM. The rep does not have to type anything.</w:t>
             </w:r>
           </w:p>
         </w:tc>
@@ -2388,7 +2346,7 @@
                 <w:sz w:val="19"/>
                 <w:szCs w:val="19"/>
               </w:rPr>
-              <w:t xml:space="preserve">Every past meeting with every customer, in one timeline on the rep's phone. The rep reads the last note before walking into the next meeting.</w:t>
+              <w:t xml:space="preserve">A phone app that shows past meetings for every customer, sorted by date. Before a follow-up meeting, the rep reads the most recent notes from their phone instead of searching old emails or opening the CRM on a laptop.</w:t>
             </w:r>
           </w:p>
         </w:tc>
@@ -2466,7 +2424,7 @@
                 <w:sz w:val="22"/>
                 <w:szCs w:val="22"/>
               </w:rPr>
-              <w:t xml:space="preserve">Admin dashboard for sales heads</w:t>
+              <w:t xml:space="preserve">Dashboard for sales heads</w:t>
             </w:r>
           </w:p>
           <w:p>
@@ -2485,7 +2443,7 @@
                 <w:sz w:val="19"/>
                 <w:szCs w:val="19"/>
               </w:rPr>
-              <w:t xml:space="preserve">Pipeline this month, taps, leads, tap-to-lead ratio, top performers, department breakdowns. </w:t>
+              <w:t xml:space="preserve">Pipeline value, total card taps, leads captured, conversion rate from tap to lead, top performers by team or department, and trends over time. </w:t>
             </w:r>
             <w:r>
               <w:rPr>
@@ -2499,7 +2457,21 @@
                 <w:sz w:val="19"/>
                 <w:szCs w:val="19"/>
               </w:rPr>
-              <w:t xml:space="preserve">Every number comes from real card activity — nothing is rep-reported.</w:t>
+              <w:t xml:space="preserve">All metrics are derived from card activity and CRM updates; </w:t>
+            </w:r>
+            <w:r>
+              <w:rPr>
+                <w:rFonts w:ascii="Arial" w:cs="Arial" w:eastAsia="Arial" w:hAnsi="Arial"/>
+                <w:b w:val="false"/>
+                <w:bCs w:val="false"/>
+                <w:i w:val="false"/>
+                <w:iCs w:val="false"/>
+                <w:caps w:val="false"/>
+                <w:color w:val="6B7280"/>
+                <w:sz w:val="19"/>
+                <w:szCs w:val="19"/>
+              </w:rPr>
+              <w:t xml:space="preserve">reps do not enter them manually.</w:t>
             </w:r>
           </w:p>
         </w:tc>
@@ -2596,7 +2568,7 @@
                 <w:sz w:val="19"/>
                 <w:szCs w:val="19"/>
               </w:rPr>
-              <w:t xml:space="preserve">Native sync into </w:t>
+              <w:t xml:space="preserve">Leads sync directly into </w:t>
             </w:r>
             <w:r>
               <w:rPr>
@@ -2624,7 +2596,7 @@
                 <w:sz w:val="19"/>
                 <w:szCs w:val="19"/>
               </w:rPr>
-              <w:t xml:space="preserve">Leads land with the right fields filled in. No copy-paste.</w:t>
+              <w:t xml:space="preserve">Each lead arrives with fields already mapped, so reps and managers do not have to copy data between systems.</w:t>
             </w:r>
           </w:p>
         </w:tc>
@@ -2723,7 +2695,7 @@
                 <w:sz w:val="19"/>
                 <w:szCs w:val="19"/>
               </w:rPr>
-              <w:t xml:space="preserve">Rep taps the card in a meeting</w:t>
+              <w:t xml:space="preserve">Rep taps the card</w:t>
             </w:r>
           </w:p>
           <w:p>
@@ -2742,7 +2714,7 @@
                 <w:sz w:val="16"/>
                 <w:szCs w:val="16"/>
               </w:rPr>
-              <w:t xml:space="preserve">The prospect's phone opens the rep's branded profile.</w:t>
+              <w:t xml:space="preserve">The customer's phone opens the rep's branded page.</w:t>
             </w:r>
           </w:p>
         </w:tc>
@@ -2835,7 +2807,7 @@
                 <w:sz w:val="19"/>
                 <w:szCs w:val="19"/>
               </w:rPr>
-              <w:t xml:space="preserve">Rep talks for one minute</w:t>
+              <w:t xml:space="preserve">Rep records the meeting</w:t>
             </w:r>
           </w:p>
           <w:p>
@@ -2854,35 +2826,7 @@
                 <w:sz w:val="16"/>
                 <w:szCs w:val="16"/>
               </w:rPr>
-              <w:t xml:space="preserve">Answers a few </w:t>
-            </w:r>
-            <w:r>
-              <w:rPr>
-                <w:rFonts w:ascii="Arial" w:cs="Arial" w:eastAsia="Arial" w:hAnsi="Arial"/>
-                <w:b/>
-                <w:bCs/>
-                <w:i w:val="false"/>
-                <w:iCs w:val="false"/>
-                <w:caps w:val="false"/>
-                <w:color w:val="6B7280"/>
-                <w:sz w:val="16"/>
-                <w:szCs w:val="16"/>
-              </w:rPr>
-              <w:t xml:space="preserve">manager-set questions </w:t>
-            </w:r>
-            <w:r>
-              <w:rPr>
-                <w:rFonts w:ascii="Arial" w:cs="Arial" w:eastAsia="Arial" w:hAnsi="Arial"/>
-                <w:b w:val="false"/>
-                <w:bCs w:val="false"/>
-                <w:i w:val="false"/>
-                <w:iCs w:val="false"/>
-                <w:caps w:val="false"/>
-                <w:color w:val="6B7280"/>
-                <w:sz w:val="16"/>
-                <w:szCs w:val="16"/>
-              </w:rPr>
-              <w:t xml:space="preserve">out loud, right after the meeting ends.</w:t>
+              <w:t xml:space="preserve">After the meeting, the rep answers a few preset questions out loud — about a minute.</w:t>
             </w:r>
           </w:p>
         </w:tc>
@@ -2975,7 +2919,7 @@
                 <w:sz w:val="19"/>
                 <w:szCs w:val="19"/>
               </w:rPr>
-              <w:t xml:space="preserve">The app structures the voice</w:t>
+              <w:t xml:space="preserve">App converts voice to data</w:t>
             </w:r>
           </w:p>
           <w:p>
@@ -2994,7 +2938,7 @@
                 <w:sz w:val="16"/>
                 <w:szCs w:val="16"/>
               </w:rPr>
-              <w:t xml:space="preserve">Pulls out name, role, deal size, next step — a clean lead.</w:t>
+              <w:t xml:space="preserve">Lead name, role, company, deal size and next step are extracted automatically.</w:t>
             </w:r>
           </w:p>
         </w:tc>
@@ -3087,7 +3031,7 @@
                 <w:sz w:val="19"/>
                 <w:szCs w:val="19"/>
               </w:rPr>
-              <w:t xml:space="preserve">Lead lands in your CRM</w:t>
+              <w:t xml:space="preserve">Lead enters the CRM</w:t>
             </w:r>
           </w:p>
           <w:p>
@@ -3106,21 +3050,7 @@
                 <w:sz w:val="16"/>
                 <w:szCs w:val="16"/>
               </w:rPr>
-              <w:t xml:space="preserve">Salesforce, HubSpot, Zoho or Odoo. </w:t>
-            </w:r>
-            <w:r>
-              <w:rPr>
-                <w:rFonts w:ascii="Arial" w:cs="Arial" w:eastAsia="Arial" w:hAnsi="Arial"/>
-                <w:b/>
-                <w:bCs/>
-                <w:i w:val="false"/>
-                <w:iCs w:val="false"/>
-                <w:caps w:val="false"/>
-                <w:color w:val="6B7280"/>
-                <w:sz w:val="16"/>
-                <w:szCs w:val="16"/>
-              </w:rPr>
-              <w:t xml:space="preserve">With GPS and tap proof.</w:t>
+              <w:t xml:space="preserve">Pushed to Salesforce, HubSpot, Zoho or Odoo, with meeting location and timestamp.</w:t>
             </w:r>
           </w:p>
         </w:tc>
@@ -3161,7 +3091,7 @@
           <w:sz w:val="21"/>
           <w:szCs w:val="21"/>
         </w:rPr>
-        <w:t xml:space="preserve">Sales teams of </w:t>
+        <w:t xml:space="preserve">Sales teams with between </w:t>
       </w:r>
       <w:r>
         <w:rPr>
@@ -3175,7 +3105,7 @@
           <w:sz w:val="21"/>
           <w:szCs w:val="21"/>
         </w:rPr>
-        <w:t xml:space="preserve">10 to 1,000+ reps, </w:t>
+        <w:t xml:space="preserve">10 and 1,000+ field reps. </w:t>
       </w:r>
       <w:r>
         <w:rPr>
@@ -3189,7 +3119,7 @@
           <w:sz w:val="21"/>
           <w:szCs w:val="21"/>
         </w:rPr>
-        <w:t xml:space="preserve">in any industry where reps meet customers face to face — insurance, real estate, banking, B2B sales, field services.</w:t>
+        <w:t xml:space="preserve">Common industries: insurance, real estate, banking, business-to-business sales, and field services.</w:t>
       </w:r>
     </w:p>
     <w:p>
@@ -3336,7 +3266,7 @@
                 <w:sz w:val="18"/>
                 <w:szCs w:val="18"/>
               </w:rPr>
-              <w:t xml:space="preserve">All-inclusive — cards, profiles, voice-to-CRM, app, dashboard, integrations. </w:t>
+              <w:t xml:space="preserve">The price includes the cards, the profiles, voice-to-CRM, the mobile app, the admin dashboard, and the CRM integrations. </w:t>
             </w:r>
             <w:r>
               <w:rPr>
@@ -3350,7 +3280,7 @@
                 <w:sz w:val="18"/>
                 <w:szCs w:val="18"/>
               </w:rPr>
-              <w:t xml:space="preserve">Add or remove seats as people join or leave.</w:t>
+              <w:t xml:space="preserve">Seats can be added or removed as team size changes.</w:t>
             </w:r>
           </w:p>
         </w:tc>
@@ -3399,7 +3329,7 @@
           <w:sz w:val="32"/>
           <w:szCs w:val="32"/>
         </w:rPr>
-        <w:t xml:space="preserve">How the two products differ.</w:t>
+        <w:t xml:space="preserve">How the two products compare.</w:t>
       </w:r>
     </w:p>
     <w:p>
@@ -3418,7 +3348,7 @@
           <w:sz w:val="19"/>
           <w:szCs w:val="19"/>
         </w:rPr>
-        <w:t xml:space="preserve">Read across. Every row in the second column is what the first column does not include.</w:t>
+        <w:t xml:space="preserve">Each row in the table below shows how the two products handle the same question.</w:t>
       </w:r>
     </w:p>
     <w:p>
@@ -3800,7 +3730,7 @@
                 <w:sz w:val="19"/>
                 <w:szCs w:val="19"/>
               </w:rPr>
-              <w:t xml:space="preserve">A matte-black NFC card and a personal web page.</w:t>
+              <w:t xml:space="preserve">An NFC card and a personal web page.</w:t>
             </w:r>
           </w:p>
         </w:tc>
@@ -3837,7 +3767,7 @@
                 <w:sz w:val="19"/>
                 <w:szCs w:val="19"/>
               </w:rPr>
-              <w:t xml:space="preserve">Branded NFC cards and profiles for every rep, plus voice-to-CRM, mobile app, admin dashboard and native CRM integrations.</w:t>
+              <w:t xml:space="preserve">Branded cards and profiles for every rep, plus voice-to-CRM, a mobile app, an admin dashboard, and CRM integrations.</w:t>
             </w:r>
           </w:p>
         </w:tc>
@@ -3877,7 +3807,7 @@
                 <w:sz w:val="16"/>
                 <w:szCs w:val="16"/>
               </w:rPr>
-              <w:t xml:space="preserve">Who owns the page</w:t>
+              <w:t xml:space="preserve">Who controls the page</w:t>
             </w:r>
           </w:p>
         </w:tc>
@@ -3914,21 +3844,7 @@
                 <w:sz w:val="19"/>
                 <w:szCs w:val="19"/>
               </w:rPr>
-              <w:t xml:space="preserve">You. </w:t>
-            </w:r>
-            <w:r>
-              <w:rPr>
-                <w:rFonts w:ascii="Arial" w:cs="Arial" w:eastAsia="Arial" w:hAnsi="Arial"/>
-                <w:b/>
-                <w:bCs/>
-                <w:i w:val="false"/>
-                <w:iCs w:val="false"/>
-                <w:caps w:val="false"/>
-                <w:color w:val="1A1A1A"/>
-                <w:sz w:val="19"/>
-                <w:szCs w:val="19"/>
-              </w:rPr>
-              <w:t xml:space="preserve">Edit it any time from your phone.</w:t>
+              <w:t xml:space="preserve">The individual themselves.</w:t>
             </w:r>
           </w:p>
         </w:tc>
@@ -3965,21 +3881,7 @@
                 <w:sz w:val="19"/>
                 <w:szCs w:val="19"/>
               </w:rPr>
-              <w:t xml:space="preserve">Your marketing team. </w:t>
-            </w:r>
-            <w:r>
-              <w:rPr>
-                <w:rFonts w:ascii="Arial" w:cs="Arial" w:eastAsia="Arial" w:hAnsi="Arial"/>
-                <w:b/>
-                <w:bCs/>
-                <w:i w:val="false"/>
-                <w:iCs w:val="false"/>
-                <w:caps w:val="false"/>
-                <w:color w:val="1A1A1A"/>
-                <w:sz w:val="19"/>
-                <w:szCs w:val="19"/>
-              </w:rPr>
-              <w:t xml:space="preserve">Locked, audited and revokable per rep.</w:t>
+              <w:t xml:space="preserve">The company's marketing team.</w:t>
             </w:r>
           </w:p>
         </w:tc>
@@ -4056,21 +3958,7 @@
                 <w:sz w:val="19"/>
                 <w:szCs w:val="19"/>
               </w:rPr>
-              <w:t xml:space="preserve">Opens your page. </w:t>
-            </w:r>
-            <w:r>
-              <w:rPr>
-                <w:rFonts w:ascii="Arial" w:cs="Arial" w:eastAsia="Arial" w:hAnsi="Arial"/>
-                <w:b/>
-                <w:bCs/>
-                <w:i w:val="false"/>
-                <w:iCs w:val="false"/>
-                <w:caps w:val="false"/>
-                <w:color w:val="1A1A1A"/>
-                <w:sz w:val="19"/>
-                <w:szCs w:val="19"/>
-              </w:rPr>
-              <w:t xml:space="preserve">They see your photo, video, story and a calendar button.</w:t>
+              <w:t xml:space="preserve">Opens the page (photo, video, bio, calendar button).</w:t>
             </w:r>
           </w:p>
         </w:tc>
@@ -4107,21 +3995,7 @@
                 <w:sz w:val="19"/>
                 <w:szCs w:val="19"/>
               </w:rPr>
-              <w:t xml:space="preserve">Opens the rep's page. </w:t>
-            </w:r>
-            <w:r>
-              <w:rPr>
-                <w:rFonts w:ascii="Arial" w:cs="Arial" w:eastAsia="Arial" w:hAnsi="Arial"/>
-                <w:b/>
-                <w:bCs/>
-                <w:i w:val="false"/>
-                <w:iCs w:val="false"/>
-                <w:caps w:val="false"/>
-                <w:color w:val="1A1A1A"/>
-                <w:sz w:val="19"/>
-                <w:szCs w:val="19"/>
-              </w:rPr>
-              <w:t xml:space="preserve">The rep then talks for one minute and a structured lead lands in your CRM.</w:t>
+              <w:t xml:space="preserve">Opens the rep's page. The rep then records the meeting by voice, and a structured lead lands in the CRM.</w:t>
             </w:r>
           </w:p>
         </w:tc>
@@ -4198,21 +4072,7 @@
                 <w:sz w:val="19"/>
                 <w:szCs w:val="19"/>
               </w:rPr>
-              <w:t xml:space="preserve">First-impression power. </w:t>
-            </w:r>
-            <w:r>
-              <w:rPr>
-                <w:rFonts w:ascii="Arial" w:cs="Arial" w:eastAsia="Arial" w:hAnsi="Arial"/>
-                <w:b/>
-                <w:bCs/>
-                <w:i w:val="false"/>
-                <w:iCs w:val="false"/>
-                <w:caps w:val="false"/>
-                <w:color w:val="1A1A1A"/>
-                <w:sz w:val="19"/>
-                <w:szCs w:val="19"/>
-              </w:rPr>
-              <w:t xml:space="preserve">Personal brand.</w:t>
+              <w:t xml:space="preserve">Replacing a paper business card.</w:t>
             </w:r>
           </w:p>
         </w:tc>
@@ -4249,21 +4109,7 @@
                 <w:sz w:val="19"/>
                 <w:szCs w:val="19"/>
               </w:rPr>
-              <w:t xml:space="preserve">Pipeline visibility. Field accountability. </w:t>
-            </w:r>
-            <w:r>
-              <w:rPr>
-                <w:rFonts w:ascii="Arial" w:cs="Arial" w:eastAsia="Arial" w:hAnsi="Arial"/>
-                <w:b/>
-                <w:bCs/>
-                <w:i w:val="false"/>
-                <w:iCs w:val="false"/>
-                <w:caps w:val="false"/>
-                <w:color w:val="1A1A1A"/>
-                <w:sz w:val="19"/>
-                <w:szCs w:val="19"/>
-              </w:rPr>
-              <w:t xml:space="preserve">CRM hygiene without typing.</w:t>
+              <w:t xml:space="preserve">Capturing meeting data straight into the CRM.</w:t>
             </w:r>
           </w:p>
         </w:tc>
@@ -4354,7 +4200,7 @@
                 <w:sz w:val="19"/>
                 <w:szCs w:val="19"/>
               </w:rPr>
-              <w:t xml:space="preserve"> One-time, total.</w:t>
+              <w:t xml:space="preserve"> Paid once.</w:t>
             </w:r>
           </w:p>
         </w:tc>
@@ -4482,21 +4328,7 @@
                 <w:sz w:val="19"/>
                 <w:szCs w:val="19"/>
               </w:rPr>
-              <w:t xml:space="preserve">Never. </w:t>
-            </w:r>
-            <w:r>
-              <w:rPr>
-                <w:rFonts w:ascii="Arial" w:cs="Arial" w:eastAsia="Arial" w:hAnsi="Arial"/>
-                <w:b/>
-                <w:bCs/>
-                <w:i w:val="false"/>
-                <w:iCs w:val="false"/>
-                <w:caps w:val="false"/>
-                <w:color w:val="1A1A1A"/>
-                <w:sz w:val="19"/>
-                <w:szCs w:val="19"/>
-              </w:rPr>
-              <w:t xml:space="preserve">Hosting is included forever.</w:t>
+              <w:t xml:space="preserve">Does not renew. Hosting is included.</w:t>
             </w:r>
           </w:p>
         </w:tc>
@@ -4533,21 +4365,7 @@
                 <w:sz w:val="19"/>
                 <w:szCs w:val="19"/>
               </w:rPr>
-              <w:t xml:space="preserve">Yearly. </w:t>
-            </w:r>
-            <w:r>
-              <w:rPr>
-                <w:rFonts w:ascii="Arial" w:cs="Arial" w:eastAsia="Arial" w:hAnsi="Arial"/>
-                <w:b/>
-                <w:bCs/>
-                <w:i w:val="false"/>
-                <w:iCs w:val="false"/>
-                <w:caps w:val="false"/>
-                <w:color w:val="1A1A1A"/>
-                <w:sz w:val="19"/>
-                <w:szCs w:val="19"/>
-              </w:rPr>
-              <w:t xml:space="preserve">Add or remove seats as people join or leave.</w:t>
+              <w:t xml:space="preserve">Yearly. Seats can be added or removed at any time.</w:t>
             </w:r>
           </w:p>
         </w:tc>
@@ -4624,7 +4442,7 @@
                 <w:sz w:val="19"/>
                 <w:szCs w:val="19"/>
               </w:rPr>
-              <w:t xml:space="preserve">Buy the card. Build your page. Hand it out.</w:t>
+              <w:t xml:space="preserve">Order the card, build the page, hand it out.</w:t>
             </w:r>
           </w:p>
         </w:tc>
@@ -4661,7 +4479,7 @@
                 <w:sz w:val="19"/>
                 <w:szCs w:val="19"/>
               </w:rPr>
-              <w:t xml:space="preserve">Onboard reps. Ship cards. Connect your CRM.</w:t>
+              <w:t xml:space="preserve">Order cards for the team, connect AceCard to your CRM, train reps on the app.</w:t>
             </w:r>
           </w:p>
         </w:tc>

</xml_diff>